<commit_message>
Revert "cambios en areas"
This reverts commit b985cdb203552747e3d6b3445aaa94786705b6a7.
</commit_message>
<xml_diff>
--- a/public/assets/documents/template-word/template_correspondencia.docx
+++ b/public/assets/documents/template-word/template_correspondencia.docx
@@ -1,6 +1,6 @@
 
 <file path=word/document.xml><?xml version="1.0" encoding="utf-8"?>
-<w:document xmlns:wpc="http://schemas.microsoft.com/office/word/2010/wordprocessingCanvas" xmlns:cx="http://schemas.microsoft.com/office/drawing/2014/chartex" xmlns:cx1="http://schemas.microsoft.com/office/drawing/2015/9/8/chartex" xmlns:cx2="http://schemas.microsoft.com/office/drawing/2015/10/21/chartex" xmlns:cx3="http://schemas.microsoft.com/office/drawing/2016/5/9/chartex" xmlns:cx4="http://schemas.microsoft.com/office/drawing/2016/5/10/chartex" xmlns:cx5="http://schemas.microsoft.com/office/drawing/2016/5/11/chartex" xmlns:cx6="http://schemas.microsoft.com/office/drawing/2016/5/12/chartex" xmlns:cx7="http://schemas.microsoft.com/office/drawing/2016/5/13/chartex" xmlns:cx8="http://schemas.microsoft.com/office/drawing/2016/5/14/chartex" xmlns:mc="http://schemas.openxmlformats.org/markup-compatibility/2006" xmlns:aink="http://schemas.microsoft.com/office/drawing/2016/ink" xmlns:am3d="http://schemas.microsoft.com/office/drawing/2017/model3d" xmlns:o="urn:schemas-microsoft-com:office:office" xmlns:oel="http://schemas.microsoft.com/office/2019/extlst" xmlns:r="http://schemas.openxmlformats.org/officeDocument/2006/relationships" xmlns:m="http://schemas.openxmlformats.org/officeDocument/2006/math" xmlns:v="urn:schemas-microsoft-com:vml" xmlns:wp14="http://schemas.microsoft.com/office/word/2010/wordprocessingDrawing" xmlns:wp="http://schemas.openxmlformats.org/drawingml/2006/wordprocessingDrawing" xmlns:w10="urn:schemas-microsoft-com:office:word" xmlns:w="http://schemas.openxmlformats.org/wordprocessingml/2006/main" xmlns:w14="http://schemas.microsoft.com/office/word/2010/wordml" xmlns:w15="http://schemas.microsoft.com/office/word/2012/wordml" xmlns:w16cex="http://schemas.microsoft.com/office/word/2018/wordml/cex" xmlns:w16cid="http://schemas.microsoft.com/office/word/2016/wordml/cid" xmlns:w16="http://schemas.microsoft.com/office/word/2018/wordml" xmlns:w16du="http://schemas.microsoft.com/office/word/2023/wordml/word16du" xmlns:w16sdtdh="http://schemas.microsoft.com/office/word/2020/wordml/sdtdatahash" xmlns:w16sdtfl="http://schemas.microsoft.com/office/word/2024/wordml/sdtformatlock" xmlns:w16se="http://schemas.microsoft.com/office/word/2015/wordml/symex" xmlns:wpg="http://schemas.microsoft.com/office/word/2010/wordprocessingGroup" xmlns:wpi="http://schemas.microsoft.com/office/word/2010/wordprocessingInk" xmlns:wne="http://schemas.microsoft.com/office/word/2006/wordml" xmlns:wps="http://schemas.microsoft.com/office/word/2010/wordprocessingShape" mc:Ignorable="w14 w15 w16se w16cid w16 w16cex w16sdtdh w16sdtfl w16du wp14">
+<w:document xmlns:wpc="http://schemas.microsoft.com/office/word/2010/wordprocessingCanvas" xmlns:cx="http://schemas.microsoft.com/office/drawing/2014/chartex" xmlns:cx1="http://schemas.microsoft.com/office/drawing/2015/9/8/chartex" xmlns:mc="http://schemas.openxmlformats.org/markup-compatibility/2006" xmlns:o="urn:schemas-microsoft-com:office:office" xmlns:r="http://schemas.openxmlformats.org/officeDocument/2006/relationships" xmlns:m="http://schemas.openxmlformats.org/officeDocument/2006/math" xmlns:v="urn:schemas-microsoft-com:vml" xmlns:wp14="http://schemas.microsoft.com/office/word/2010/wordprocessingDrawing" xmlns:wp="http://schemas.openxmlformats.org/drawingml/2006/wordprocessingDrawing" xmlns:w10="urn:schemas-microsoft-com:office:word" xmlns:w="http://schemas.openxmlformats.org/wordprocessingml/2006/main" xmlns:w14="http://schemas.microsoft.com/office/word/2010/wordml" xmlns:w15="http://schemas.microsoft.com/office/word/2012/wordml" xmlns:w16se="http://schemas.microsoft.com/office/word/2015/wordml/symex" xmlns:wpg="http://schemas.microsoft.com/office/word/2010/wordprocessingGroup" xmlns:wpi="http://schemas.microsoft.com/office/word/2010/wordprocessingInk" xmlns:wne="http://schemas.microsoft.com/office/word/2006/wordml" xmlns:wps="http://schemas.microsoft.com/office/word/2010/wordprocessingShape" mc:Ignorable="w14 w15 w16se wp14">
   <w:body>
     <w:p>
       <w:pPr>
@@ -77,12 +77,37 @@
                             <w:pPr>
                               <w:jc w:val="right"/>
                             </w:pPr>
+                            <w:proofErr w:type="spellStart"/>
                             <w:r>
                               <w:rPr>
                                 <w:rFonts w:ascii="Noto Sans" w:eastAsia="Noto Sans" w:hAnsi="Noto Sans" w:cs="Noto Sans"/>
                                 <w:lang w:val="en-US"/>
                               </w:rPr>
-                              <w:t>Fecha de emisión:</w:t>
+                              <w:t>Fecha</w:t>
+                            </w:r>
+                            <w:proofErr w:type="spellEnd"/>
+                            <w:r>
+                              <w:rPr>
+                                <w:rFonts w:ascii="Noto Sans" w:eastAsia="Noto Sans" w:hAnsi="Noto Sans" w:cs="Noto Sans"/>
+                                <w:lang w:val="en-US"/>
+                              </w:rPr>
+                              <w:t xml:space="preserve"> de </w:t>
+                            </w:r>
+                            <w:proofErr w:type="spellStart"/>
+                            <w:r>
+                              <w:rPr>
+                                <w:rFonts w:ascii="Noto Sans" w:eastAsia="Noto Sans" w:hAnsi="Noto Sans" w:cs="Noto Sans"/>
+                                <w:lang w:val="en-US"/>
+                              </w:rPr>
+                              <w:t>emisión</w:t>
+                            </w:r>
+                            <w:proofErr w:type="spellEnd"/>
+                            <w:r>
+                              <w:rPr>
+                                <w:rFonts w:ascii="Noto Sans" w:eastAsia="Noto Sans" w:hAnsi="Noto Sans" w:cs="Noto Sans"/>
+                                <w:lang w:val="en-US"/>
+                              </w:rPr>
+                              <w:t>:</w:t>
                             </w:r>
                           </w:p>
                         </w:txbxContent>
@@ -108,7 +133,7 @@
                 <v:stroke joinstyle="miter"/>
                 <v:path gradientshapeok="t" o:connecttype="rect"/>
               </v:shapetype>
-              <v:shape id="Cuadro de texto 2" o:spid="_x0000_s1026" type="#_x0000_t202" style="position:absolute;margin-left:333.15pt;margin-top:23.6pt;width:133.5pt;height:21pt;z-index:251662336;visibility:visible;mso-wrap-style:square;mso-width-percent:0;mso-height-percent:0;mso-wrap-distance-left:9pt;mso-wrap-distance-top:3.6pt;mso-wrap-distance-right:9pt;mso-wrap-distance-bottom:3.6pt;mso-position-horizontal:absolute;mso-position-horizontal-relative:margin;mso-position-vertical:absolute;mso-position-vertical-relative:text;mso-width-percent:0;mso-height-percent:0;mso-width-relative:margin;mso-height-relative:margin;v-text-anchor:top" o:gfxdata="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" filled="f" stroked="f">
+              <v:shape id="Cuadro de texto 2" o:spid="_x0000_s1026" type="#_x0000_t202" style="position:absolute;margin-left:333.15pt;margin-top:23.6pt;width:133.5pt;height:21pt;z-index:251662336;visibility:visible;mso-wrap-style:square;mso-width-percent:0;mso-height-percent:0;mso-wrap-distance-left:9pt;mso-wrap-distance-top:3.6pt;mso-wrap-distance-right:9pt;mso-wrap-distance-bottom:3.6pt;mso-position-horizontal:absolute;mso-position-horizontal-relative:margin;mso-position-vertical:absolute;mso-position-vertical-relative:text;mso-width-percent:0;mso-height-percent:0;mso-width-relative:margin;mso-height-relative:margin;v-text-anchor:top" o:gfxdata="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" filled="f" stroked="f">
                 <v:textbox>
                   <w:txbxContent>
                     <w:p>
@@ -164,10 +189,10 @@
         <w:tblLook w:val="04A0" w:firstRow="1" w:lastRow="0" w:firstColumn="1" w:lastColumn="0" w:noHBand="0" w:noVBand="1"/>
       </w:tblPr>
       <w:tblGrid>
-        <w:gridCol w:w="1740"/>
-        <w:gridCol w:w="5384"/>
-        <w:gridCol w:w="1946"/>
-        <w:gridCol w:w="1567"/>
+        <w:gridCol w:w="1684"/>
+        <w:gridCol w:w="5427"/>
+        <w:gridCol w:w="1958"/>
+        <w:gridCol w:w="1568"/>
       </w:tblGrid>
       <w:tr>
         <w:trPr>
@@ -192,6 +217,7 @@
                 <w:lang w:val="en-US"/>
               </w:rPr>
             </w:pPr>
+            <w:proofErr w:type="spellStart"/>
             <w:r>
               <w:rPr>
                 <w:rFonts w:ascii="Noto Sans" w:eastAsia="Noto Sans" w:hAnsi="Noto Sans" w:cs="Noto Sans"/>
@@ -201,6 +227,7 @@
               </w:rPr>
               <w:t>Tipo</w:t>
             </w:r>
+            <w:proofErr w:type="spellEnd"/>
           </w:p>
         </w:tc>
         <w:tc>
@@ -221,6 +248,7 @@
                 <w:lang w:val="en-US"/>
               </w:rPr>
             </w:pPr>
+            <w:proofErr w:type="spellStart"/>
             <w:r>
               <w:rPr>
                 <w:rFonts w:ascii="Noto Sans" w:eastAsia="Noto Sans" w:hAnsi="Noto Sans" w:cs="Noto Sans"/>
@@ -230,6 +258,7 @@
               </w:rPr>
               <w:t>Descripción</w:t>
             </w:r>
+            <w:proofErr w:type="spellEnd"/>
           </w:p>
         </w:tc>
         <w:tc>
@@ -250,6 +279,7 @@
                 <w:lang w:val="en-US"/>
               </w:rPr>
             </w:pPr>
+            <w:proofErr w:type="spellStart"/>
             <w:r>
               <w:rPr>
                 <w:rFonts w:ascii="Noto Sans" w:eastAsia="Noto Sans" w:hAnsi="Noto Sans" w:cs="Noto Sans"/>
@@ -259,6 +289,7 @@
               </w:rPr>
               <w:t>Tipo</w:t>
             </w:r>
+            <w:proofErr w:type="spellEnd"/>
           </w:p>
         </w:tc>
         <w:tc>
@@ -278,6 +309,7 @@
                 <w:lang w:val="en-US"/>
               </w:rPr>
             </w:pPr>
+            <w:proofErr w:type="spellStart"/>
             <w:r>
               <w:rPr>
                 <w:rFonts w:ascii="Noto Sans" w:eastAsia="Noto Sans" w:hAnsi="Noto Sans" w:cs="Noto Sans"/>
@@ -287,6 +319,7 @@
               </w:rPr>
               <w:t>Descripción</w:t>
             </w:r>
+            <w:proofErr w:type="spellEnd"/>
           </w:p>
         </w:tc>
       </w:tr>
@@ -321,6 +354,7 @@
               </w:rPr>
               <w:t xml:space="preserve">No. </w:t>
             </w:r>
+            <w:proofErr w:type="spellStart"/>
             <w:r>
               <w:rPr>
                 <w:rFonts w:ascii="Noto Sans" w:eastAsia="Noto Sans" w:hAnsi="Noto Sans" w:cs="Noto Sans"/>
@@ -342,6 +376,7 @@
               </w:rPr>
               <w:t>no</w:t>
             </w:r>
+            <w:proofErr w:type="spellEnd"/>
             <w:r>
               <w:rPr>
                 <w:u w:val="single"/>
@@ -391,13 +426,31 @@
                 <w:lang w:val="en-US"/>
               </w:rPr>
             </w:pPr>
+            <w:proofErr w:type="spellStart"/>
             <w:r>
               <w:rPr>
                 <w:rFonts w:ascii="Noto Sans" w:eastAsia="Noto Sans" w:hAnsi="Noto Sans" w:cs="Noto Sans"/>
                 <w:lang w:val="en-US"/>
               </w:rPr>
-              <w:t>Fecha inicio</w:t>
-            </w:r>
+              <w:t>Fecha</w:t>
+            </w:r>
+            <w:proofErr w:type="spellEnd"/>
+            <w:r>
+              <w:rPr>
+                <w:rFonts w:ascii="Noto Sans" w:eastAsia="Noto Sans" w:hAnsi="Noto Sans" w:cs="Noto Sans"/>
+                <w:lang w:val="en-US"/>
+              </w:rPr>
+              <w:t xml:space="preserve"> </w:t>
+            </w:r>
+            <w:proofErr w:type="spellStart"/>
+            <w:r>
+              <w:rPr>
+                <w:rFonts w:ascii="Noto Sans" w:eastAsia="Noto Sans" w:hAnsi="Noto Sans" w:cs="Noto Sans"/>
+                <w:lang w:val="en-US"/>
+              </w:rPr>
+              <w:t>inicio</w:t>
+            </w:r>
+            <w:proofErr w:type="spellEnd"/>
           </w:p>
         </w:tc>
         <w:tc>
@@ -494,12 +547,21 @@
                 <w:lang w:val="en-US"/>
               </w:rPr>
             </w:pPr>
+            <w:proofErr w:type="spellStart"/>
             <w:r>
               <w:rPr>
                 <w:rFonts w:ascii="Noto Sans" w:eastAsia="Noto Sans" w:hAnsi="Noto Sans" w:cs="Noto Sans"/>
                 <w:lang w:val="en-US"/>
               </w:rPr>
-              <w:t xml:space="preserve">Fecha </w:t>
+              <w:t>Fecha</w:t>
+            </w:r>
+            <w:proofErr w:type="spellEnd"/>
+            <w:r>
+              <w:rPr>
+                <w:rFonts w:ascii="Noto Sans" w:eastAsia="Noto Sans" w:hAnsi="Noto Sans" w:cs="Noto Sans"/>
+                <w:lang w:val="en-US"/>
+              </w:rPr>
+              <w:t xml:space="preserve"> </w:t>
             </w:r>
             <w:r>
               <w:rPr>
@@ -560,8 +622,17 @@
                 <w:rFonts w:ascii="Noto Sans" w:eastAsia="Noto Sans" w:hAnsi="Noto Sans" w:cs="Noto Sans"/>
                 <w:lang w:val="en-US"/>
               </w:rPr>
-              <w:t>Fol. Gestión</w:t>
-            </w:r>
+              <w:t xml:space="preserve">Fol. </w:t>
+            </w:r>
+            <w:proofErr w:type="spellStart"/>
+            <w:r>
+              <w:rPr>
+                <w:rFonts w:ascii="Noto Sans" w:eastAsia="Noto Sans" w:hAnsi="Noto Sans" w:cs="Noto Sans"/>
+                <w:lang w:val="en-US"/>
+              </w:rPr>
+              <w:t>Gestión</w:t>
+            </w:r>
+            <w:proofErr w:type="spellEnd"/>
           </w:p>
         </w:tc>
         <w:tc>
@@ -604,20 +675,31 @@
                 <w:lang w:val="en-US"/>
               </w:rPr>
             </w:pPr>
+            <w:proofErr w:type="spellStart"/>
             <w:r>
               <w:rPr>
                 <w:rFonts w:ascii="Noto Sans" w:eastAsia="Noto Sans" w:hAnsi="Noto Sans" w:cs="Noto Sans"/>
                 <w:lang w:val="en-US"/>
               </w:rPr>
-              <w:t xml:space="preserve">Fecha </w:t>
-            </w:r>
+              <w:t>Fecha</w:t>
+            </w:r>
+            <w:proofErr w:type="spellEnd"/>
             <w:r>
               <w:rPr>
                 <w:rFonts w:ascii="Noto Sans" w:eastAsia="Noto Sans" w:hAnsi="Noto Sans" w:cs="Noto Sans"/>
                 <w:lang w:val="en-US"/>
               </w:rPr>
+              <w:t xml:space="preserve"> </w:t>
+            </w:r>
+            <w:r>
+              <w:rPr>
+                <w:rFonts w:ascii="Noto Sans" w:eastAsia="Noto Sans" w:hAnsi="Noto Sans" w:cs="Noto Sans"/>
+                <w:lang w:val="en-US"/>
+              </w:rPr>
               <w:t>doc.</w:t>
             </w:r>
+            <w:bookmarkStart w:id="0" w:name="_GoBack"/>
+            <w:bookmarkEnd w:id="0"/>
           </w:p>
         </w:tc>
         <w:tc>
@@ -666,6 +748,7 @@
                 <w:lang w:val="en-US"/>
               </w:rPr>
             </w:pPr>
+            <w:proofErr w:type="spellStart"/>
             <w:r>
               <w:rPr>
                 <w:rFonts w:ascii="Noto Sans" w:eastAsia="Noto Sans" w:hAnsi="Noto Sans" w:cs="Noto Sans"/>
@@ -673,6 +756,7 @@
               </w:rPr>
               <w:t>Unidad</w:t>
             </w:r>
+            <w:proofErr w:type="spellEnd"/>
           </w:p>
         </w:tc>
         <w:tc>
@@ -730,6 +814,7 @@
                 <w:lang w:val="en-US"/>
               </w:rPr>
             </w:pPr>
+            <w:proofErr w:type="spellStart"/>
             <w:r>
               <w:rPr>
                 <w:rFonts w:ascii="Noto Sans" w:eastAsia="Noto Sans" w:hAnsi="Noto Sans" w:cs="Noto Sans"/>
@@ -737,6 +822,7 @@
               </w:rPr>
               <w:t>Coordinación</w:t>
             </w:r>
+            <w:proofErr w:type="spellEnd"/>
           </w:p>
         </w:tc>
         <w:tc>
@@ -786,12 +872,21 @@
                 <w:lang w:val="en-US"/>
               </w:rPr>
             </w:pPr>
+            <w:proofErr w:type="spellStart"/>
             <w:r>
               <w:rPr>
                 <w:rFonts w:ascii="Noto Sans" w:eastAsia="Noto Sans" w:hAnsi="Noto Sans" w:cs="Noto Sans"/>
                 <w:lang w:val="en-US"/>
               </w:rPr>
-              <w:t>Turnado a</w:t>
+              <w:t>Turnado</w:t>
+            </w:r>
+            <w:proofErr w:type="spellEnd"/>
+            <w:r>
+              <w:rPr>
+                <w:rFonts w:ascii="Noto Sans" w:eastAsia="Noto Sans" w:hAnsi="Noto Sans" w:cs="Noto Sans"/>
+                <w:lang w:val="en-US"/>
+              </w:rPr>
+              <w:t xml:space="preserve"> a</w:t>
             </w:r>
           </w:p>
         </w:tc>
@@ -842,12 +937,21 @@
                 <w:lang w:val="en-US"/>
               </w:rPr>
             </w:pPr>
+            <w:proofErr w:type="spellStart"/>
             <w:r>
               <w:rPr>
                 <w:rFonts w:ascii="Noto Sans" w:eastAsia="Noto Sans" w:hAnsi="Noto Sans" w:cs="Noto Sans"/>
                 <w:lang w:val="en-US"/>
               </w:rPr>
-              <w:t>Copia a</w:t>
+              <w:t>Copia</w:t>
+            </w:r>
+            <w:proofErr w:type="spellEnd"/>
+            <w:r>
+              <w:rPr>
+                <w:rFonts w:ascii="Noto Sans" w:eastAsia="Noto Sans" w:hAnsi="Noto Sans" w:cs="Noto Sans"/>
+                <w:lang w:val="en-US"/>
+              </w:rPr>
+              <w:t xml:space="preserve"> a</w:t>
             </w:r>
           </w:p>
         </w:tc>
@@ -1305,7 +1409,7 @@
                 <w:sz w:val="16"/>
                 <w:lang w:val="en-US"/>
               </w:rPr>
-              <w:t>COORDINACIÓN TÉCNICA DE NÓMINA</w:t>
+              <w:t>COORDINACIÓN TÉCNICA DE NÓMINA IMSS-BIENESTAR Y HRAES</w:t>
             </w:r>
           </w:p>
           <w:p>
@@ -2751,6 +2855,7 @@
                 <w:lang w:val="en-US"/>
               </w:rPr>
             </w:pPr>
+            <w:proofErr w:type="spellStart"/>
             <w:r>
               <w:rPr>
                 <w:rFonts w:ascii="Noto Sans" w:eastAsia="Noto Sans" w:hAnsi="Noto Sans" w:cs="Noto Sans"/>
@@ -2758,6 +2863,7 @@
               </w:rPr>
               <w:t>Trámite</w:t>
             </w:r>
+            <w:proofErr w:type="spellEnd"/>
           </w:p>
         </w:tc>
         <w:tc>
@@ -2807,6 +2913,7 @@
                 <w:lang w:val="en-US"/>
               </w:rPr>
             </w:pPr>
+            <w:proofErr w:type="spellStart"/>
             <w:r>
               <w:rPr>
                 <w:rFonts w:ascii="Noto Sans" w:eastAsia="Noto Sans" w:hAnsi="Noto Sans" w:cs="Noto Sans"/>
@@ -2814,6 +2921,7 @@
               </w:rPr>
               <w:t>Código</w:t>
             </w:r>
+            <w:proofErr w:type="spellEnd"/>
           </w:p>
         </w:tc>
         <w:tc>
@@ -2863,6 +2971,7 @@
                 <w:lang w:val="en-US"/>
               </w:rPr>
             </w:pPr>
+            <w:proofErr w:type="spellStart"/>
             <w:r>
               <w:rPr>
                 <w:rFonts w:ascii="Noto Sans" w:eastAsia="Noto Sans" w:hAnsi="Noto Sans" w:cs="Noto Sans"/>
@@ -2870,6 +2979,7 @@
               </w:rPr>
               <w:t>Remitente</w:t>
             </w:r>
+            <w:proofErr w:type="spellEnd"/>
           </w:p>
         </w:tc>
         <w:tc>
@@ -2919,6 +3029,7 @@
                 <w:lang w:val="en-US"/>
               </w:rPr>
             </w:pPr>
+            <w:proofErr w:type="spellStart"/>
             <w:r>
               <w:rPr>
                 <w:rFonts w:ascii="Noto Sans" w:eastAsia="Noto Sans" w:hAnsi="Noto Sans" w:cs="Noto Sans"/>
@@ -2926,6 +3037,7 @@
               </w:rPr>
               <w:t>Puesto</w:t>
             </w:r>
+            <w:proofErr w:type="spellEnd"/>
           </w:p>
         </w:tc>
         <w:tc>
@@ -2983,6 +3095,7 @@
                 <w:lang w:val="en-US"/>
               </w:rPr>
             </w:pPr>
+            <w:proofErr w:type="spellStart"/>
             <w:r>
               <w:rPr>
                 <w:rFonts w:ascii="Noto Sans" w:eastAsia="Noto Sans" w:hAnsi="Noto Sans" w:cs="Noto Sans"/>
@@ -2990,6 +3103,7 @@
               </w:rPr>
               <w:t>Asunto</w:t>
             </w:r>
+            <w:proofErr w:type="spellEnd"/>
           </w:p>
         </w:tc>
         <w:tc>
@@ -3127,6 +3241,7 @@
                 <w:lang w:val="en-US"/>
               </w:rPr>
             </w:pPr>
+            <w:proofErr w:type="spellStart"/>
             <w:r>
               <w:rPr>
                 <w:rFonts w:ascii="Noto Sans" w:eastAsia="Noto Sans" w:hAnsi="Noto Sans" w:cs="Noto Sans"/>
@@ -3134,6 +3249,7 @@
               </w:rPr>
               <w:t>Observaciones</w:t>
             </w:r>
+            <w:proofErr w:type="spellEnd"/>
           </w:p>
         </w:tc>
         <w:tc>
@@ -3207,6 +3323,7 @@
                 <w:lang w:val="en-US"/>
               </w:rPr>
             </w:pPr>
+            <w:proofErr w:type="spellStart"/>
             <w:r>
               <w:rPr>
                 <w:rFonts w:ascii="Noto Sans" w:eastAsia="Noto Sans" w:hAnsi="Noto Sans" w:cs="Noto Sans"/>
@@ -3214,6 +3331,7 @@
               </w:rPr>
               <w:t>Usuario</w:t>
             </w:r>
+            <w:proofErr w:type="spellEnd"/>
           </w:p>
         </w:tc>
         <w:tc>
@@ -3264,7 +3382,6 @@
           <w:szCs w:val="16"/>
           <w:lang w:eastAsia="es-MX"/>
         </w:rPr>
-        <w:lastRenderedPageBreak/>
         <mc:AlternateContent>
           <mc:Choice Requires="wps">
             <w:drawing>
@@ -3426,8 +3543,19 @@
                                 <w:szCs w:val="20"/>
                                 <w:lang w:val="en-US"/>
                               </w:rPr>
-                              <w:t>Responsible de Control de Gestión</w:t>
+                              <w:t xml:space="preserve">Responsible de Control de </w:t>
                             </w:r>
+                            <w:proofErr w:type="spellStart"/>
+                            <w:r>
+                              <w:rPr>
+                                <w:rFonts w:ascii="Montserrat" w:eastAsia="Noto Sans" w:hAnsi="Montserrat" w:cs="Noto Sans"/>
+                                <w:sz w:val="20"/>
+                                <w:szCs w:val="20"/>
+                                <w:lang w:val="en-US"/>
+                              </w:rPr>
+                              <w:t>Gestión</w:t>
+                            </w:r>
+                            <w:proofErr w:type="spellEnd"/>
                           </w:p>
                           <w:p>
                             <w:pPr>
@@ -3470,7 +3598,7 @@
           </mc:Choice>
           <mc:Fallback>
             <w:pict>
-              <v:shape w14:anchorId="773414AD" id="_x0000_s1027" type="#_x0000_t202" style="position:absolute;margin-left:-36pt;margin-top:20.95pt;width:612pt;height:45.65pt;z-index:251735040;visibility:visible;mso-wrap-style:square;mso-width-percent:0;mso-height-percent:0;mso-wrap-distance-left:9pt;mso-wrap-distance-top:3.6pt;mso-wrap-distance-right:9pt;mso-wrap-distance-bottom:3.6pt;mso-position-horizontal:absolute;mso-position-horizontal-relative:margin;mso-position-vertical:absolute;mso-position-vertical-relative:text;mso-width-percent:0;mso-height-percent:0;mso-width-relative:margin;mso-height-relative:margin;v-text-anchor:top" o:gfxdata="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" filled="f" stroked="f">
+              <v:shape w14:anchorId="773414AD" id="_x0000_s1027" type="#_x0000_t202" style="position:absolute;margin-left:-36pt;margin-top:20.95pt;width:612pt;height:45.65pt;z-index:251735040;visibility:visible;mso-wrap-style:square;mso-width-percent:0;mso-height-percent:0;mso-wrap-distance-left:9pt;mso-wrap-distance-top:3.6pt;mso-wrap-distance-right:9pt;mso-wrap-distance-bottom:3.6pt;mso-position-horizontal:absolute;mso-position-horizontal-relative:margin;mso-position-vertical:absolute;mso-position-vertical-relative:text;mso-width-percent:0;mso-height-percent:0;mso-width-relative:margin;mso-height-relative:margin;v-text-anchor:top" o:gfxdata="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" filled="f" stroked="f">
                 <v:textbox>
                   <w:txbxContent>
                     <w:p>
@@ -3511,7 +3639,7 @@
                                     </pic:cNvPicPr>
                                   </pic:nvPicPr>
                                   <pic:blipFill>
-                                    <a:blip r:embed="rId7">
+                                    <a:blip r:embed="rId8">
                                       <a:extLst>
                                         <a:ext uri="{28A0092B-C50C-407E-A947-70E740481C1C}">
                                           <a14:useLocalDpi xmlns:a14="http://schemas.microsoft.com/office/drawing/2010/main" val="0"/>
@@ -3619,8 +3747,8 @@
       </w:r>
     </w:p>
     <w:sectPr>
-      <w:headerReference w:type="default" r:id="rId8"/>
-      <w:footerReference w:type="default" r:id="rId9"/>
+      <w:headerReference w:type="default" r:id="rId9"/>
+      <w:footerReference w:type="default" r:id="rId10"/>
       <w:pgSz w:w="12240" w:h="15840"/>
       <w:pgMar w:top="720" w:right="720" w:bottom="720" w:left="720" w:header="708" w:footer="708" w:gutter="0"/>
       <w:pgBorders w:offsetFrom="page">
@@ -3636,7 +3764,7 @@
 </file>
 
 <file path=word/endnotes.xml><?xml version="1.0" encoding="utf-8"?>
-<w:endnotes xmlns:wpc="http://schemas.microsoft.com/office/word/2010/wordprocessingCanvas" xmlns:cx="http://schemas.microsoft.com/office/drawing/2014/chartex" xmlns:cx1="http://schemas.microsoft.com/office/drawing/2015/9/8/chartex" xmlns:cx2="http://schemas.microsoft.com/office/drawing/2015/10/21/chartex" xmlns:cx3="http://schemas.microsoft.com/office/drawing/2016/5/9/chartex" xmlns:cx4="http://schemas.microsoft.com/office/drawing/2016/5/10/chartex" xmlns:cx5="http://schemas.microsoft.com/office/drawing/2016/5/11/chartex" xmlns:cx6="http://schemas.microsoft.com/office/drawing/2016/5/12/chartex" xmlns:cx7="http://schemas.microsoft.com/office/drawing/2016/5/13/chartex" xmlns:cx8="http://schemas.microsoft.com/office/drawing/2016/5/14/chartex" xmlns:mc="http://schemas.openxmlformats.org/markup-compatibility/2006" xmlns:aink="http://schemas.microsoft.com/office/drawing/2016/ink" xmlns:am3d="http://schemas.microsoft.com/office/drawing/2017/model3d" xmlns:o="urn:schemas-microsoft-com:office:office" xmlns:oel="http://schemas.microsoft.com/office/2019/extlst" xmlns:r="http://schemas.openxmlformats.org/officeDocument/2006/relationships" xmlns:m="http://schemas.openxmlformats.org/officeDocument/2006/math" xmlns:v="urn:schemas-microsoft-com:vml" xmlns:wp14="http://schemas.microsoft.com/office/word/2010/wordprocessingDrawing" xmlns:wp="http://schemas.openxmlformats.org/drawingml/2006/wordprocessingDrawing" xmlns:w10="urn:schemas-microsoft-com:office:word" xmlns:w="http://schemas.openxmlformats.org/wordprocessingml/2006/main" xmlns:w14="http://schemas.microsoft.com/office/word/2010/wordml" xmlns:w15="http://schemas.microsoft.com/office/word/2012/wordml" xmlns:w16cex="http://schemas.microsoft.com/office/word/2018/wordml/cex" xmlns:w16cid="http://schemas.microsoft.com/office/word/2016/wordml/cid" xmlns:w16="http://schemas.microsoft.com/office/word/2018/wordml" xmlns:w16du="http://schemas.microsoft.com/office/word/2023/wordml/word16du" xmlns:w16sdtdh="http://schemas.microsoft.com/office/word/2020/wordml/sdtdatahash" xmlns:w16sdtfl="http://schemas.microsoft.com/office/word/2024/wordml/sdtformatlock" xmlns:w16se="http://schemas.microsoft.com/office/word/2015/wordml/symex" xmlns:wpg="http://schemas.microsoft.com/office/word/2010/wordprocessingGroup" xmlns:wpi="http://schemas.microsoft.com/office/word/2010/wordprocessingInk" xmlns:wne="http://schemas.microsoft.com/office/word/2006/wordml" xmlns:wps="http://schemas.microsoft.com/office/word/2010/wordprocessingShape" mc:Ignorable="w14 w15 w16se w16cid w16 w16cex w16sdtdh w16sdtfl w16du wp14">
+<w:endnotes xmlns:wpc="http://schemas.microsoft.com/office/word/2010/wordprocessingCanvas" xmlns:cx="http://schemas.microsoft.com/office/drawing/2014/chartex" xmlns:cx1="http://schemas.microsoft.com/office/drawing/2015/9/8/chartex" xmlns:mc="http://schemas.openxmlformats.org/markup-compatibility/2006" xmlns:o="urn:schemas-microsoft-com:office:office" xmlns:r="http://schemas.openxmlformats.org/officeDocument/2006/relationships" xmlns:m="http://schemas.openxmlformats.org/officeDocument/2006/math" xmlns:v="urn:schemas-microsoft-com:vml" xmlns:wp14="http://schemas.microsoft.com/office/word/2010/wordprocessingDrawing" xmlns:wp="http://schemas.openxmlformats.org/drawingml/2006/wordprocessingDrawing" xmlns:w10="urn:schemas-microsoft-com:office:word" xmlns:w="http://schemas.openxmlformats.org/wordprocessingml/2006/main" xmlns:w14="http://schemas.microsoft.com/office/word/2010/wordml" xmlns:w15="http://schemas.microsoft.com/office/word/2012/wordml" xmlns:w16se="http://schemas.microsoft.com/office/word/2015/wordml/symex" xmlns:wpg="http://schemas.microsoft.com/office/word/2010/wordprocessingGroup" xmlns:wpi="http://schemas.microsoft.com/office/word/2010/wordprocessingInk" xmlns:wne="http://schemas.microsoft.com/office/word/2006/wordml" xmlns:wps="http://schemas.microsoft.com/office/word/2010/wordprocessingShape" mc:Ignorable="w14 w15 w16se wp14">
   <w:endnote w:type="separator" w:id="-1">
     <w:p>
       <w:pPr>
@@ -3661,7 +3789,7 @@
 </file>
 
 <file path=word/footer1.xml><?xml version="1.0" encoding="utf-8"?>
-<w:ftr xmlns:wpc="http://schemas.microsoft.com/office/word/2010/wordprocessingCanvas" xmlns:cx="http://schemas.microsoft.com/office/drawing/2014/chartex" xmlns:cx1="http://schemas.microsoft.com/office/drawing/2015/9/8/chartex" xmlns:cx2="http://schemas.microsoft.com/office/drawing/2015/10/21/chartex" xmlns:cx3="http://schemas.microsoft.com/office/drawing/2016/5/9/chartex" xmlns:cx4="http://schemas.microsoft.com/office/drawing/2016/5/10/chartex" xmlns:cx5="http://schemas.microsoft.com/office/drawing/2016/5/11/chartex" xmlns:cx6="http://schemas.microsoft.com/office/drawing/2016/5/12/chartex" xmlns:cx7="http://schemas.microsoft.com/office/drawing/2016/5/13/chartex" xmlns:cx8="http://schemas.microsoft.com/office/drawing/2016/5/14/chartex" xmlns:mc="http://schemas.openxmlformats.org/markup-compatibility/2006" xmlns:aink="http://schemas.microsoft.com/office/drawing/2016/ink" xmlns:am3d="http://schemas.microsoft.com/office/drawing/2017/model3d" xmlns:o="urn:schemas-microsoft-com:office:office" xmlns:oel="http://schemas.microsoft.com/office/2019/extlst" xmlns:r="http://schemas.openxmlformats.org/officeDocument/2006/relationships" xmlns:m="http://schemas.openxmlformats.org/officeDocument/2006/math" xmlns:v="urn:schemas-microsoft-com:vml" xmlns:wp14="http://schemas.microsoft.com/office/word/2010/wordprocessingDrawing" xmlns:wp="http://schemas.openxmlformats.org/drawingml/2006/wordprocessingDrawing" xmlns:w10="urn:schemas-microsoft-com:office:word" xmlns:w="http://schemas.openxmlformats.org/wordprocessingml/2006/main" xmlns:w14="http://schemas.microsoft.com/office/word/2010/wordml" xmlns:w15="http://schemas.microsoft.com/office/word/2012/wordml" xmlns:w16cex="http://schemas.microsoft.com/office/word/2018/wordml/cex" xmlns:w16cid="http://schemas.microsoft.com/office/word/2016/wordml/cid" xmlns:w16="http://schemas.microsoft.com/office/word/2018/wordml" xmlns:w16du="http://schemas.microsoft.com/office/word/2023/wordml/word16du" xmlns:w16sdtdh="http://schemas.microsoft.com/office/word/2020/wordml/sdtdatahash" xmlns:w16sdtfl="http://schemas.microsoft.com/office/word/2024/wordml/sdtformatlock" xmlns:w16se="http://schemas.microsoft.com/office/word/2015/wordml/symex" xmlns:wpg="http://schemas.microsoft.com/office/word/2010/wordprocessingGroup" xmlns:wpi="http://schemas.microsoft.com/office/word/2010/wordprocessingInk" xmlns:wne="http://schemas.microsoft.com/office/word/2006/wordml" xmlns:wps="http://schemas.microsoft.com/office/word/2010/wordprocessingShape" mc:Ignorable="w14 w15 w16se w16cid w16 w16cex w16sdtdh w16sdtfl w16du wp14">
+<w:ftr xmlns:wpc="http://schemas.microsoft.com/office/word/2010/wordprocessingCanvas" xmlns:cx="http://schemas.microsoft.com/office/drawing/2014/chartex" xmlns:cx1="http://schemas.microsoft.com/office/drawing/2015/9/8/chartex" xmlns:mc="http://schemas.openxmlformats.org/markup-compatibility/2006" xmlns:o="urn:schemas-microsoft-com:office:office" xmlns:r="http://schemas.openxmlformats.org/officeDocument/2006/relationships" xmlns:m="http://schemas.openxmlformats.org/officeDocument/2006/math" xmlns:v="urn:schemas-microsoft-com:vml" xmlns:wp14="http://schemas.microsoft.com/office/word/2010/wordprocessingDrawing" xmlns:wp="http://schemas.openxmlformats.org/drawingml/2006/wordprocessingDrawing" xmlns:w10="urn:schemas-microsoft-com:office:word" xmlns:w="http://schemas.openxmlformats.org/wordprocessingml/2006/main" xmlns:w14="http://schemas.microsoft.com/office/word/2010/wordml" xmlns:w15="http://schemas.microsoft.com/office/word/2012/wordml" xmlns:w16se="http://schemas.microsoft.com/office/word/2015/wordml/symex" xmlns:wpg="http://schemas.microsoft.com/office/word/2010/wordprocessingGroup" xmlns:wpi="http://schemas.microsoft.com/office/word/2010/wordprocessingInk" xmlns:wne="http://schemas.microsoft.com/office/word/2006/wordml" xmlns:wps="http://schemas.microsoft.com/office/word/2010/wordprocessingShape" mc:Ignorable="w14 w15 w16se wp14">
   <w:p>
     <w:pPr>
       <w:pStyle w:val="Piedepgina"/>
@@ -3751,7 +3879,7 @@
 </file>
 
 <file path=word/footnotes.xml><?xml version="1.0" encoding="utf-8"?>
-<w:footnotes xmlns:wpc="http://schemas.microsoft.com/office/word/2010/wordprocessingCanvas" xmlns:cx="http://schemas.microsoft.com/office/drawing/2014/chartex" xmlns:cx1="http://schemas.microsoft.com/office/drawing/2015/9/8/chartex" xmlns:cx2="http://schemas.microsoft.com/office/drawing/2015/10/21/chartex" xmlns:cx3="http://schemas.microsoft.com/office/drawing/2016/5/9/chartex" xmlns:cx4="http://schemas.microsoft.com/office/drawing/2016/5/10/chartex" xmlns:cx5="http://schemas.microsoft.com/office/drawing/2016/5/11/chartex" xmlns:cx6="http://schemas.microsoft.com/office/drawing/2016/5/12/chartex" xmlns:cx7="http://schemas.microsoft.com/office/drawing/2016/5/13/chartex" xmlns:cx8="http://schemas.microsoft.com/office/drawing/2016/5/14/chartex" xmlns:mc="http://schemas.openxmlformats.org/markup-compatibility/2006" xmlns:aink="http://schemas.microsoft.com/office/drawing/2016/ink" xmlns:am3d="http://schemas.microsoft.com/office/drawing/2017/model3d" xmlns:o="urn:schemas-microsoft-com:office:office" xmlns:oel="http://schemas.microsoft.com/office/2019/extlst" xmlns:r="http://schemas.openxmlformats.org/officeDocument/2006/relationships" xmlns:m="http://schemas.openxmlformats.org/officeDocument/2006/math" xmlns:v="urn:schemas-microsoft-com:vml" xmlns:wp14="http://schemas.microsoft.com/office/word/2010/wordprocessingDrawing" xmlns:wp="http://schemas.openxmlformats.org/drawingml/2006/wordprocessingDrawing" xmlns:w10="urn:schemas-microsoft-com:office:word" xmlns:w="http://schemas.openxmlformats.org/wordprocessingml/2006/main" xmlns:w14="http://schemas.microsoft.com/office/word/2010/wordml" xmlns:w15="http://schemas.microsoft.com/office/word/2012/wordml" xmlns:w16cex="http://schemas.microsoft.com/office/word/2018/wordml/cex" xmlns:w16cid="http://schemas.microsoft.com/office/word/2016/wordml/cid" xmlns:w16="http://schemas.microsoft.com/office/word/2018/wordml" xmlns:w16du="http://schemas.microsoft.com/office/word/2023/wordml/word16du" xmlns:w16sdtdh="http://schemas.microsoft.com/office/word/2020/wordml/sdtdatahash" xmlns:w16sdtfl="http://schemas.microsoft.com/office/word/2024/wordml/sdtformatlock" xmlns:w16se="http://schemas.microsoft.com/office/word/2015/wordml/symex" xmlns:wpg="http://schemas.microsoft.com/office/word/2010/wordprocessingGroup" xmlns:wpi="http://schemas.microsoft.com/office/word/2010/wordprocessingInk" xmlns:wne="http://schemas.microsoft.com/office/word/2006/wordml" xmlns:wps="http://schemas.microsoft.com/office/word/2010/wordprocessingShape" mc:Ignorable="w14 w15 w16se w16cid w16 w16cex w16sdtdh w16sdtfl w16du wp14">
+<w:footnotes xmlns:wpc="http://schemas.microsoft.com/office/word/2010/wordprocessingCanvas" xmlns:cx="http://schemas.microsoft.com/office/drawing/2014/chartex" xmlns:cx1="http://schemas.microsoft.com/office/drawing/2015/9/8/chartex" xmlns:mc="http://schemas.openxmlformats.org/markup-compatibility/2006" xmlns:o="urn:schemas-microsoft-com:office:office" xmlns:r="http://schemas.openxmlformats.org/officeDocument/2006/relationships" xmlns:m="http://schemas.openxmlformats.org/officeDocument/2006/math" xmlns:v="urn:schemas-microsoft-com:vml" xmlns:wp14="http://schemas.microsoft.com/office/word/2010/wordprocessingDrawing" xmlns:wp="http://schemas.openxmlformats.org/drawingml/2006/wordprocessingDrawing" xmlns:w10="urn:schemas-microsoft-com:office:word" xmlns:w="http://schemas.openxmlformats.org/wordprocessingml/2006/main" xmlns:w14="http://schemas.microsoft.com/office/word/2010/wordml" xmlns:w15="http://schemas.microsoft.com/office/word/2012/wordml" xmlns:w16se="http://schemas.microsoft.com/office/word/2015/wordml/symex" xmlns:wpg="http://schemas.microsoft.com/office/word/2010/wordprocessingGroup" xmlns:wpi="http://schemas.microsoft.com/office/word/2010/wordprocessingInk" xmlns:wne="http://schemas.microsoft.com/office/word/2006/wordml" xmlns:wps="http://schemas.microsoft.com/office/word/2010/wordprocessingShape" mc:Ignorable="w14 w15 w16se wp14">
   <w:footnote w:type="separator" w:id="-1">
     <w:p>
       <w:pPr>
@@ -3776,7 +3904,7 @@
 </file>
 
 <file path=word/header1.xml><?xml version="1.0" encoding="utf-8"?>
-<w:hdr xmlns:wpc="http://schemas.microsoft.com/office/word/2010/wordprocessingCanvas" xmlns:cx="http://schemas.microsoft.com/office/drawing/2014/chartex" xmlns:cx1="http://schemas.microsoft.com/office/drawing/2015/9/8/chartex" xmlns:cx2="http://schemas.microsoft.com/office/drawing/2015/10/21/chartex" xmlns:cx3="http://schemas.microsoft.com/office/drawing/2016/5/9/chartex" xmlns:cx4="http://schemas.microsoft.com/office/drawing/2016/5/10/chartex" xmlns:cx5="http://schemas.microsoft.com/office/drawing/2016/5/11/chartex" xmlns:cx6="http://schemas.microsoft.com/office/drawing/2016/5/12/chartex" xmlns:cx7="http://schemas.microsoft.com/office/drawing/2016/5/13/chartex" xmlns:cx8="http://schemas.microsoft.com/office/drawing/2016/5/14/chartex" xmlns:mc="http://schemas.openxmlformats.org/markup-compatibility/2006" xmlns:aink="http://schemas.microsoft.com/office/drawing/2016/ink" xmlns:am3d="http://schemas.microsoft.com/office/drawing/2017/model3d" xmlns:o="urn:schemas-microsoft-com:office:office" xmlns:oel="http://schemas.microsoft.com/office/2019/extlst" xmlns:r="http://schemas.openxmlformats.org/officeDocument/2006/relationships" xmlns:m="http://schemas.openxmlformats.org/officeDocument/2006/math" xmlns:v="urn:schemas-microsoft-com:vml" xmlns:wp14="http://schemas.microsoft.com/office/word/2010/wordprocessingDrawing" xmlns:wp="http://schemas.openxmlformats.org/drawingml/2006/wordprocessingDrawing" xmlns:w10="urn:schemas-microsoft-com:office:word" xmlns:w="http://schemas.openxmlformats.org/wordprocessingml/2006/main" xmlns:w14="http://schemas.microsoft.com/office/word/2010/wordml" xmlns:w15="http://schemas.microsoft.com/office/word/2012/wordml" xmlns:w16cex="http://schemas.microsoft.com/office/word/2018/wordml/cex" xmlns:w16cid="http://schemas.microsoft.com/office/word/2016/wordml/cid" xmlns:w16="http://schemas.microsoft.com/office/word/2018/wordml" xmlns:w16du="http://schemas.microsoft.com/office/word/2023/wordml/word16du" xmlns:w16sdtdh="http://schemas.microsoft.com/office/word/2020/wordml/sdtdatahash" xmlns:w16sdtfl="http://schemas.microsoft.com/office/word/2024/wordml/sdtformatlock" xmlns:w16se="http://schemas.microsoft.com/office/word/2015/wordml/symex" xmlns:wpg="http://schemas.microsoft.com/office/word/2010/wordprocessingGroup" xmlns:wpi="http://schemas.microsoft.com/office/word/2010/wordprocessingInk" xmlns:wne="http://schemas.microsoft.com/office/word/2006/wordml" xmlns:wps="http://schemas.microsoft.com/office/word/2010/wordprocessingShape" mc:Ignorable="w14 w15 w16se w16cid w16 w16cex w16sdtdh w16sdtfl w16du wp14">
+<w:hdr xmlns:wpc="http://schemas.microsoft.com/office/word/2010/wordprocessingCanvas" xmlns:cx="http://schemas.microsoft.com/office/drawing/2014/chartex" xmlns:cx1="http://schemas.microsoft.com/office/drawing/2015/9/8/chartex" xmlns:mc="http://schemas.openxmlformats.org/markup-compatibility/2006" xmlns:o="urn:schemas-microsoft-com:office:office" xmlns:r="http://schemas.openxmlformats.org/officeDocument/2006/relationships" xmlns:m="http://schemas.openxmlformats.org/officeDocument/2006/math" xmlns:v="urn:schemas-microsoft-com:vml" xmlns:wp14="http://schemas.microsoft.com/office/word/2010/wordprocessingDrawing" xmlns:wp="http://schemas.openxmlformats.org/drawingml/2006/wordprocessingDrawing" xmlns:w10="urn:schemas-microsoft-com:office:word" xmlns:w="http://schemas.openxmlformats.org/wordprocessingml/2006/main" xmlns:w14="http://schemas.microsoft.com/office/word/2010/wordml" xmlns:w15="http://schemas.microsoft.com/office/word/2012/wordml" xmlns:w16se="http://schemas.microsoft.com/office/word/2015/wordml/symex" xmlns:wpg="http://schemas.microsoft.com/office/word/2010/wordprocessingGroup" xmlns:wpi="http://schemas.microsoft.com/office/word/2010/wordprocessingInk" xmlns:wne="http://schemas.microsoft.com/office/word/2006/wordml" xmlns:wps="http://schemas.microsoft.com/office/word/2010/wordprocessingShape" mc:Ignorable="w14 w15 w16se wp14">
   <w:p>
     <w:pPr>
       <w:pStyle w:val="Encabezado"/>
@@ -4005,7 +4133,7 @@
 </file>
 
 <file path=word/styles.xml><?xml version="1.0" encoding="utf-8"?>
-<w:styles xmlns:mc="http://schemas.openxmlformats.org/markup-compatibility/2006" xmlns:r="http://schemas.openxmlformats.org/officeDocument/2006/relationships" xmlns:w="http://schemas.openxmlformats.org/wordprocessingml/2006/main" xmlns:w14="http://schemas.microsoft.com/office/word/2010/wordml" xmlns:w15="http://schemas.microsoft.com/office/word/2012/wordml" xmlns:w16cex="http://schemas.microsoft.com/office/word/2018/wordml/cex" xmlns:w16cid="http://schemas.microsoft.com/office/word/2016/wordml/cid" xmlns:w16="http://schemas.microsoft.com/office/word/2018/wordml" xmlns:w16du="http://schemas.microsoft.com/office/word/2023/wordml/word16du" xmlns:w16sdtdh="http://schemas.microsoft.com/office/word/2020/wordml/sdtdatahash" xmlns:w16sdtfl="http://schemas.microsoft.com/office/word/2024/wordml/sdtformatlock" xmlns:w16se="http://schemas.microsoft.com/office/word/2015/wordml/symex" mc:Ignorable="w14 w15 w16se w16cid w16 w16cex w16sdtdh w16sdtfl w16du">
+<w:styles xmlns:mc="http://schemas.openxmlformats.org/markup-compatibility/2006" xmlns:r="http://schemas.openxmlformats.org/officeDocument/2006/relationships" xmlns:w="http://schemas.openxmlformats.org/wordprocessingml/2006/main" xmlns:w14="http://schemas.microsoft.com/office/word/2010/wordml" xmlns:w15="http://schemas.microsoft.com/office/word/2012/wordml" xmlns:w16se="http://schemas.microsoft.com/office/word/2015/wordml/symex" mc:Ignorable="w14 w15 w16se">
   <w:docDefaults>
     <w:rPrDefault>
       <w:rPr>
@@ -4023,7 +4151,7 @@
       </w:pPr>
     </w:pPrDefault>
   </w:docDefaults>
-  <w:latentStyles w:defLockedState="0" w:defUIPriority="99" w:defSemiHidden="0" w:defUnhideWhenUsed="0" w:defQFormat="0" w:count="376">
+  <w:latentStyles w:defLockedState="0" w:defUIPriority="99" w:defSemiHidden="0" w:defUnhideWhenUsed="0" w:defQFormat="0" w:count="371">
     <w:lsdException w:name="Normal" w:uiPriority="0" w:qFormat="1"/>
     <w:lsdException w:name="heading 1" w:uiPriority="9" w:qFormat="1"/>
     <w:lsdException w:name="heading 2" w:semiHidden="1" w:uiPriority="9" w:unhideWhenUsed="1" w:qFormat="1"/>
@@ -4395,11 +4523,6 @@
     <w:lsdException w:name="List Table 5 Dark Accent 6" w:uiPriority="50"/>
     <w:lsdException w:name="List Table 6 Colorful Accent 6" w:uiPriority="51"/>
     <w:lsdException w:name="List Table 7 Colorful Accent 6" w:uiPriority="52"/>
-    <w:lsdException w:name="Mention" w:semiHidden="1" w:unhideWhenUsed="1"/>
-    <w:lsdException w:name="Smart Hyperlink" w:semiHidden="1" w:unhideWhenUsed="1"/>
-    <w:lsdException w:name="Hashtag" w:semiHidden="1" w:unhideWhenUsed="1"/>
-    <w:lsdException w:name="Unresolved Mention" w:semiHidden="1" w:unhideWhenUsed="1"/>
-    <w:lsdException w:name="Smart Link" w:semiHidden="1" w:unhideWhenUsed="1"/>
   </w:latentStyles>
   <w:style w:type="paragraph" w:default="1" w:styleId="Normal">
     <w:name w:val="Normal"/>

</xml_diff>

<commit_message>
correcion en archivos de impresion
</commit_message>
<xml_diff>
--- a/public/assets/documents/template-word/template_correspondencia.docx
+++ b/public/assets/documents/template-word/template_correspondencia.docx
@@ -315,7 +315,6 @@
                                 <w:lang w:val="en-US"/>
                               </w:rPr>
                             </w:pPr>
-                            <w:proofErr w:type="spellStart"/>
                             <w:r>
                               <w:rPr>
                                 <w:rFonts w:ascii="Montserrat" w:eastAsia="Noto Sans" w:hAnsi="Montserrat" w:cs="Noto Sans"/>
@@ -341,29 +340,8 @@
                                 <w:szCs w:val="20"/>
                                 <w:lang w:val="en-US"/>
                               </w:rPr>
-                              <w:t>ble</w:t>
+                              <w:t>ble de Control de Gestión</w:t>
                             </w:r>
-                            <w:proofErr w:type="spellEnd"/>
-                            <w:r>
-                              <w:rPr>
-                                <w:rFonts w:ascii="Montserrat" w:eastAsia="Noto Sans" w:hAnsi="Montserrat" w:cs="Noto Sans"/>
-                                <w:sz w:val="20"/>
-                                <w:szCs w:val="20"/>
-                                <w:lang w:val="en-US"/>
-                              </w:rPr>
-                              <w:t xml:space="preserve"> de Control de </w:t>
-                            </w:r>
-                            <w:proofErr w:type="spellStart"/>
-                            <w:r>
-                              <w:rPr>
-                                <w:rFonts w:ascii="Montserrat" w:eastAsia="Noto Sans" w:hAnsi="Montserrat" w:cs="Noto Sans"/>
-                                <w:sz w:val="20"/>
-                                <w:szCs w:val="20"/>
-                                <w:lang w:val="en-US"/>
-                              </w:rPr>
-                              <w:t>Gestión</w:t>
-                            </w:r>
-                            <w:proofErr w:type="spellEnd"/>
                           </w:p>
                           <w:p>
                             <w:pPr>
@@ -447,7 +425,7 @@
                                     </pic:cNvPicPr>
                                   </pic:nvPicPr>
                                   <pic:blipFill>
-                                    <a:blip r:embed="rId7">
+                                    <a:blip r:embed="rId8">
                                       <a:extLst>
                                         <a:ext uri="{28A0092B-C50C-407E-A947-70E740481C1C}">
                                           <a14:useLocalDpi xmlns:a14="http://schemas.microsoft.com/office/drawing/2010/main" val="0"/>
@@ -749,7 +727,6 @@
                 <w:lang w:val="en-US"/>
               </w:rPr>
             </w:pPr>
-            <w:proofErr w:type="spellStart"/>
             <w:r>
               <w:rPr>
                 <w:rFonts w:ascii="Noto Sans" w:eastAsia="Noto Sans" w:hAnsi="Noto Sans" w:cs="Noto Sans"/>
@@ -759,7 +736,6 @@
               </w:rPr>
               <w:t>Descripción</w:t>
             </w:r>
-            <w:proofErr w:type="spellEnd"/>
           </w:p>
         </w:tc>
         <w:tc>
@@ -808,7 +784,6 @@
                 <w:lang w:val="en-US"/>
               </w:rPr>
             </w:pPr>
-            <w:proofErr w:type="spellStart"/>
             <w:r>
               <w:rPr>
                 <w:rFonts w:ascii="Noto Sans" w:eastAsia="Noto Sans" w:hAnsi="Noto Sans" w:cs="Noto Sans"/>
@@ -818,7 +793,6 @@
               </w:rPr>
               <w:t>Descripción</w:t>
             </w:r>
-            <w:proofErr w:type="spellEnd"/>
           </w:p>
         </w:tc>
       </w:tr>
@@ -853,7 +827,6 @@
               </w:rPr>
               <w:t xml:space="preserve">No. </w:t>
             </w:r>
-            <w:proofErr w:type="spellStart"/>
             <w:r>
               <w:rPr>
                 <w:rFonts w:ascii="Noto Sans" w:eastAsia="Noto Sans" w:hAnsi="Noto Sans" w:cs="Noto Sans"/>
@@ -875,7 +848,6 @@
               </w:rPr>
               <w:t>no</w:t>
             </w:r>
-            <w:proofErr w:type="spellEnd"/>
             <w:r>
               <w:rPr>
                 <w:u w:val="single"/>
@@ -925,31 +897,13 @@
                 <w:lang w:val="en-US"/>
               </w:rPr>
             </w:pPr>
-            <w:proofErr w:type="spellStart"/>
             <w:r>
               <w:rPr>
                 <w:rFonts w:ascii="Noto Sans" w:eastAsia="Noto Sans" w:hAnsi="Noto Sans" w:cs="Noto Sans"/>
                 <w:lang w:val="en-US"/>
               </w:rPr>
-              <w:t>Fecha</w:t>
+              <w:t>Fecha inicio</w:t>
             </w:r>
-            <w:proofErr w:type="spellEnd"/>
-            <w:r>
-              <w:rPr>
-                <w:rFonts w:ascii="Noto Sans" w:eastAsia="Noto Sans" w:hAnsi="Noto Sans" w:cs="Noto Sans"/>
-                <w:lang w:val="en-US"/>
-              </w:rPr>
-              <w:t xml:space="preserve"> </w:t>
-            </w:r>
-            <w:proofErr w:type="spellStart"/>
-            <w:r>
-              <w:rPr>
-                <w:rFonts w:ascii="Noto Sans" w:eastAsia="Noto Sans" w:hAnsi="Noto Sans" w:cs="Noto Sans"/>
-                <w:lang w:val="en-US"/>
-              </w:rPr>
-              <w:t>inicio</w:t>
-            </w:r>
-            <w:proofErr w:type="spellEnd"/>
           </w:p>
         </w:tc>
         <w:tc>
@@ -1046,21 +1000,12 @@
                 <w:lang w:val="en-US"/>
               </w:rPr>
             </w:pPr>
-            <w:proofErr w:type="spellStart"/>
             <w:r>
               <w:rPr>
                 <w:rFonts w:ascii="Noto Sans" w:eastAsia="Noto Sans" w:hAnsi="Noto Sans" w:cs="Noto Sans"/>
                 <w:lang w:val="en-US"/>
               </w:rPr>
-              <w:t>Fecha</w:t>
-            </w:r>
-            <w:proofErr w:type="spellEnd"/>
-            <w:r>
-              <w:rPr>
-                <w:rFonts w:ascii="Noto Sans" w:eastAsia="Noto Sans" w:hAnsi="Noto Sans" w:cs="Noto Sans"/>
-                <w:lang w:val="en-US"/>
-              </w:rPr>
-              <w:t xml:space="preserve"> </w:t>
+              <w:t xml:space="preserve">Fecha </w:t>
             </w:r>
             <w:r>
               <w:rPr>
@@ -1121,74 +1066,56 @@
                 <w:rFonts w:ascii="Noto Sans" w:eastAsia="Noto Sans" w:hAnsi="Noto Sans" w:cs="Noto Sans"/>
                 <w:lang w:val="en-US"/>
               </w:rPr>
-              <w:t xml:space="preserve">Fol. </w:t>
+              <w:t>Fol. Gestión</w:t>
             </w:r>
-            <w:proofErr w:type="spellStart"/>
+          </w:p>
+        </w:tc>
+        <w:tc>
+          <w:tcPr>
+            <w:tcW w:w="5384" w:type="dxa"/>
+            <w:tcBorders>
+              <w:top w:val="nil"/>
+              <w:left w:val="single" w:sz="18" w:space="0" w:color="FFFFFF" w:themeColor="background1"/>
+              <w:bottom w:val="nil"/>
+              <w:right w:val="single" w:sz="18" w:space="0" w:color="FFFFFF" w:themeColor="background1"/>
+            </w:tcBorders>
+            <w:shd w:val="clear" w:color="auto" w:fill="D9D9D9" w:themeFill="background1" w:themeFillShade="D9"/>
+            <w:vAlign w:val="center"/>
+          </w:tcPr>
+          <w:p>
+            <w:pPr>
+              <w:rPr>
+                <w:lang w:val="en-US"/>
+              </w:rPr>
+            </w:pPr>
+          </w:p>
+        </w:tc>
+        <w:tc>
+          <w:tcPr>
+            <w:tcW w:w="1946" w:type="dxa"/>
+            <w:tcBorders>
+              <w:top w:val="nil"/>
+              <w:left w:val="single" w:sz="18" w:space="0" w:color="FFFFFF" w:themeColor="background1"/>
+              <w:bottom w:val="nil"/>
+              <w:right w:val="single" w:sz="18" w:space="0" w:color="FFFFFF" w:themeColor="background1"/>
+            </w:tcBorders>
+            <w:shd w:val="clear" w:color="auto" w:fill="D9D9D9" w:themeFill="background1" w:themeFillShade="D9"/>
+            <w:vAlign w:val="center"/>
+          </w:tcPr>
+          <w:p>
+            <w:pPr>
+              <w:jc w:val="center"/>
+              <w:rPr>
+                <w:rFonts w:ascii="Noto Sans" w:eastAsia="Noto Sans" w:hAnsi="Noto Sans" w:cs="Noto Sans"/>
+                <w:lang w:val="en-US"/>
+              </w:rPr>
+            </w:pPr>
             <w:r>
               <w:rPr>
                 <w:rFonts w:ascii="Noto Sans" w:eastAsia="Noto Sans" w:hAnsi="Noto Sans" w:cs="Noto Sans"/>
                 <w:lang w:val="en-US"/>
               </w:rPr>
-              <w:t>Gestión</w:t>
-            </w:r>
-            <w:proofErr w:type="spellEnd"/>
-          </w:p>
-        </w:tc>
-        <w:tc>
-          <w:tcPr>
-            <w:tcW w:w="5384" w:type="dxa"/>
-            <w:tcBorders>
-              <w:top w:val="nil"/>
-              <w:left w:val="single" w:sz="18" w:space="0" w:color="FFFFFF" w:themeColor="background1"/>
-              <w:bottom w:val="nil"/>
-              <w:right w:val="single" w:sz="18" w:space="0" w:color="FFFFFF" w:themeColor="background1"/>
-            </w:tcBorders>
-            <w:shd w:val="clear" w:color="auto" w:fill="D9D9D9" w:themeFill="background1" w:themeFillShade="D9"/>
-            <w:vAlign w:val="center"/>
-          </w:tcPr>
-          <w:p>
-            <w:pPr>
-              <w:rPr>
-                <w:lang w:val="en-US"/>
-              </w:rPr>
-            </w:pPr>
-          </w:p>
-        </w:tc>
-        <w:tc>
-          <w:tcPr>
-            <w:tcW w:w="1946" w:type="dxa"/>
-            <w:tcBorders>
-              <w:top w:val="nil"/>
-              <w:left w:val="single" w:sz="18" w:space="0" w:color="FFFFFF" w:themeColor="background1"/>
-              <w:bottom w:val="nil"/>
-              <w:right w:val="single" w:sz="18" w:space="0" w:color="FFFFFF" w:themeColor="background1"/>
-            </w:tcBorders>
-            <w:shd w:val="clear" w:color="auto" w:fill="D9D9D9" w:themeFill="background1" w:themeFillShade="D9"/>
-            <w:vAlign w:val="center"/>
-          </w:tcPr>
-          <w:p>
-            <w:pPr>
-              <w:jc w:val="center"/>
-              <w:rPr>
-                <w:rFonts w:ascii="Noto Sans" w:eastAsia="Noto Sans" w:hAnsi="Noto Sans" w:cs="Noto Sans"/>
-                <w:lang w:val="en-US"/>
-              </w:rPr>
-            </w:pPr>
-            <w:proofErr w:type="spellStart"/>
-            <w:r>
-              <w:rPr>
-                <w:rFonts w:ascii="Noto Sans" w:eastAsia="Noto Sans" w:hAnsi="Noto Sans" w:cs="Noto Sans"/>
-                <w:lang w:val="en-US"/>
-              </w:rPr>
-              <w:t>Fecha</w:t>
-            </w:r>
-            <w:proofErr w:type="spellEnd"/>
-            <w:r>
-              <w:rPr>
-                <w:rFonts w:ascii="Noto Sans" w:eastAsia="Noto Sans" w:hAnsi="Noto Sans" w:cs="Noto Sans"/>
-                <w:lang w:val="en-US"/>
-              </w:rPr>
-              <w:t xml:space="preserve"> </w:t>
+              <w:t xml:space="preserve">Fecha </w:t>
             </w:r>
             <w:r>
               <w:rPr>
@@ -1309,7 +1236,6 @@
                 <w:lang w:val="en-US"/>
               </w:rPr>
             </w:pPr>
-            <w:proofErr w:type="spellStart"/>
             <w:r>
               <w:rPr>
                 <w:rFonts w:ascii="Noto Sans" w:eastAsia="Noto Sans" w:hAnsi="Noto Sans" w:cs="Noto Sans"/>
@@ -1317,7 +1243,6 @@
               </w:rPr>
               <w:t>Coordinación</w:t>
             </w:r>
-            <w:proofErr w:type="spellEnd"/>
           </w:p>
         </w:tc>
         <w:tc>
@@ -1367,28 +1292,12 @@
                 <w:lang w:val="en-US"/>
               </w:rPr>
             </w:pPr>
-            <w:proofErr w:type="spellStart"/>
             <w:r>
               <w:rPr>
                 <w:rFonts w:ascii="Noto Sans" w:eastAsia="Noto Sans" w:hAnsi="Noto Sans" w:cs="Noto Sans"/>
                 <w:lang w:val="en-US"/>
               </w:rPr>
-              <w:t>Turnado</w:t>
-            </w:r>
-            <w:proofErr w:type="spellEnd"/>
-            <w:r>
-              <w:rPr>
-                <w:rFonts w:ascii="Noto Sans" w:eastAsia="Noto Sans" w:hAnsi="Noto Sans" w:cs="Noto Sans"/>
-                <w:lang w:val="en-US"/>
-              </w:rPr>
-              <w:t xml:space="preserve"> a</w:t>
-            </w:r>
-            <w:r>
-              <w:rPr>
-                <w:rFonts w:ascii="Noto Sans" w:eastAsia="Noto Sans" w:hAnsi="Noto Sans" w:cs="Noto Sans"/>
-                <w:lang w:val="en-US"/>
-              </w:rPr>
-              <w:t xml:space="preserve"> (III)</w:t>
+              <w:t>Área / Zona</w:t>
             </w:r>
           </w:p>
         </w:tc>
@@ -1442,21 +1351,12 @@
                 <w:lang w:val="en-US"/>
               </w:rPr>
             </w:pPr>
-            <w:proofErr w:type="spellStart"/>
             <w:r>
               <w:rPr>
                 <w:rFonts w:ascii="Noto Sans" w:eastAsia="Noto Sans" w:hAnsi="Noto Sans" w:cs="Noto Sans"/>
                 <w:lang w:val="en-US"/>
               </w:rPr>
-              <w:t>Turnado</w:t>
-            </w:r>
-            <w:proofErr w:type="spellEnd"/>
-            <w:r>
-              <w:rPr>
-                <w:rFonts w:ascii="Noto Sans" w:eastAsia="Noto Sans" w:hAnsi="Noto Sans" w:cs="Noto Sans"/>
-                <w:lang w:val="en-US"/>
-              </w:rPr>
-              <w:t xml:space="preserve"> a (II)</w:t>
+              <w:t>C.R.H.T.</w:t>
             </w:r>
           </w:p>
         </w:tc>
@@ -1513,21 +1413,12 @@
                 <w:lang w:val="en-US"/>
               </w:rPr>
             </w:pPr>
-            <w:proofErr w:type="spellStart"/>
             <w:r>
               <w:rPr>
                 <w:rFonts w:ascii="Noto Sans" w:eastAsia="Noto Sans" w:hAnsi="Noto Sans" w:cs="Noto Sans"/>
                 <w:lang w:val="en-US"/>
               </w:rPr>
-              <w:t>Turnado</w:t>
-            </w:r>
-            <w:proofErr w:type="spellEnd"/>
-            <w:r>
-              <w:rPr>
-                <w:rFonts w:ascii="Noto Sans" w:eastAsia="Noto Sans" w:hAnsi="Noto Sans" w:cs="Noto Sans"/>
-                <w:lang w:val="en-US"/>
-              </w:rPr>
-              <w:t xml:space="preserve"> a (I)</w:t>
+              <w:t>C.R.H.</w:t>
             </w:r>
           </w:p>
         </w:tc>
@@ -1577,7 +1468,6 @@
                 <w:lang w:val="en-US"/>
               </w:rPr>
             </w:pPr>
-            <w:proofErr w:type="spellStart"/>
             <w:r>
               <w:rPr>
                 <w:rFonts w:ascii="Noto Sans" w:eastAsia="Noto Sans" w:hAnsi="Noto Sans" w:cs="Noto Sans"/>
@@ -1585,7 +1475,6 @@
               </w:rPr>
               <w:t>Trámite</w:t>
             </w:r>
-            <w:proofErr w:type="spellEnd"/>
           </w:p>
         </w:tc>
         <w:tc>
@@ -1632,6 +1521,7 @@
             <w:pPr>
               <w:rPr>
                 <w:rFonts w:ascii="Noto Sans" w:eastAsia="Noto Sans" w:hAnsi="Noto Sans" w:cs="Noto Sans"/>
+                <w:u w:val="single"/>
                 <w:lang w:val="en-US"/>
               </w:rPr>
             </w:pPr>
@@ -1640,7 +1530,7 @@
                 <w:rFonts w:ascii="Noto Sans" w:eastAsia="Noto Sans" w:hAnsi="Noto Sans" w:cs="Noto Sans"/>
                 <w:lang w:val="en-US"/>
               </w:rPr>
-              <w:t>Código</w:t>
+              <w:t>Clave</w:t>
             </w:r>
           </w:p>
         </w:tc>
@@ -1691,7 +1581,6 @@
                 <w:lang w:val="en-US"/>
               </w:rPr>
             </w:pPr>
-            <w:proofErr w:type="spellStart"/>
             <w:r>
               <w:rPr>
                 <w:rFonts w:ascii="Noto Sans" w:eastAsia="Noto Sans" w:hAnsi="Noto Sans" w:cs="Noto Sans"/>
@@ -1699,7 +1588,6 @@
               </w:rPr>
               <w:t>Remitente</w:t>
             </w:r>
-            <w:proofErr w:type="spellEnd"/>
           </w:p>
         </w:tc>
         <w:tc>
@@ -1749,7 +1637,6 @@
                 <w:lang w:val="en-US"/>
               </w:rPr>
             </w:pPr>
-            <w:proofErr w:type="spellStart"/>
             <w:r>
               <w:rPr>
                 <w:rFonts w:ascii="Noto Sans" w:eastAsia="Noto Sans" w:hAnsi="Noto Sans" w:cs="Noto Sans"/>
@@ -1757,7 +1644,6 @@
               </w:rPr>
               <w:t>Puesto</w:t>
             </w:r>
-            <w:proofErr w:type="spellEnd"/>
           </w:p>
         </w:tc>
         <w:tc>
@@ -1815,7 +1701,6 @@
                 <w:lang w:val="en-US"/>
               </w:rPr>
             </w:pPr>
-            <w:proofErr w:type="spellStart"/>
             <w:r>
               <w:rPr>
                 <w:rFonts w:ascii="Noto Sans" w:eastAsia="Noto Sans" w:hAnsi="Noto Sans" w:cs="Noto Sans"/>
@@ -1823,7 +1708,6 @@
               </w:rPr>
               <w:t>Asunto</w:t>
             </w:r>
-            <w:proofErr w:type="spellEnd"/>
           </w:p>
         </w:tc>
         <w:tc>
@@ -1961,7 +1845,6 @@
                 <w:lang w:val="en-US"/>
               </w:rPr>
             </w:pPr>
-            <w:proofErr w:type="spellStart"/>
             <w:r>
               <w:rPr>
                 <w:rFonts w:ascii="Noto Sans" w:eastAsia="Noto Sans" w:hAnsi="Noto Sans" w:cs="Noto Sans"/>
@@ -1969,7 +1852,6 @@
               </w:rPr>
               <w:t>Observaciones</w:t>
             </w:r>
-            <w:proofErr w:type="spellEnd"/>
           </w:p>
         </w:tc>
         <w:tc>
@@ -2043,7 +1925,6 @@
                 <w:lang w:val="en-US"/>
               </w:rPr>
             </w:pPr>
-            <w:proofErr w:type="spellStart"/>
             <w:r>
               <w:rPr>
                 <w:rFonts w:ascii="Noto Sans" w:eastAsia="Noto Sans" w:hAnsi="Noto Sans" w:cs="Noto Sans"/>
@@ -2051,7 +1932,6 @@
               </w:rPr>
               <w:t>Usuario</w:t>
             </w:r>
-            <w:proofErr w:type="spellEnd"/>
           </w:p>
         </w:tc>
         <w:tc>
@@ -2092,8 +1972,8 @@
       </w:pPr>
     </w:p>
     <w:sectPr>
-      <w:headerReference w:type="default" r:id="rId8"/>
-      <w:footerReference w:type="default" r:id="rId9"/>
+      <w:headerReference w:type="default" r:id="rId9"/>
+      <w:footerReference w:type="default" r:id="rId10"/>
       <w:pgSz w:w="12240" w:h="15840"/>
       <w:pgMar w:top="720" w:right="720" w:bottom="567" w:left="720" w:header="709" w:footer="709" w:gutter="0"/>
       <w:pgBorders w:offsetFrom="page">

</xml_diff>